<commit_message>
added book to syllabus
</commit_message>
<xml_diff>
--- a/DS6015_syllabus.docx
+++ b/DS6015_syllabus.docx
@@ -51,7 +51,7 @@
           <w:sz w:val="24"/>
           <w:szCs w:val="24"/>
         </w:rPr>
-        <w:t>July 14</w:t>
+        <w:t>September 6</w:t>
       </w:r>
       <w:r>
         <w:rPr>
@@ -263,6 +263,81 @@
           <w:lang w:val="en-US" w:eastAsia="en-US" w:bidi="ar-SA"/>
         </w:rPr>
         <w:t>4. Demonstrate oral and written communication skills through a formal paper and presentation of project outcomes</w:t>
+      </w:r>
+    </w:p>
+    <w:p>
+      <w:pPr>
+        <w:pStyle w:val="Heading1"/>
+        <w:rPr>
+          <w:rFonts w:ascii="Calibri" w:hAnsi="Calibri" w:eastAsia="" w:cs="Times New Roman (Headings CS)" w:eastAsiaTheme="majorEastAsia"/>
+          <w:b/>
+          <w:b/>
+          <w:bCs/>
+          <w:color w:val="000000" w:themeColor="text1"/>
+          <w:kern w:val="0"/>
+          <w:sz w:val="24"/>
+          <w:szCs w:val="32"/>
+          <w:lang w:val="en-US" w:eastAsia="en-US" w:bidi="ar-SA"/>
+        </w:rPr>
+      </w:pPr>
+      <w:r>
+        <w:rPr>
+          <w:rFonts w:eastAsia="" w:cs="Times New Roman (Headings CS)" w:ascii="Calibri" w:hAnsi="Calibri" w:eastAsiaTheme="majorEastAsia"/>
+          <w:b/>
+          <w:bCs/>
+          <w:color w:val="000000" w:themeColor="text1"/>
+          <w:kern w:val="0"/>
+          <w:sz w:val="24"/>
+          <w:szCs w:val="32"/>
+          <w:lang w:val="en-US" w:eastAsia="en-US" w:bidi="ar-SA"/>
+        </w:rPr>
+        <w:t>Textbooks</w:t>
+      </w:r>
+    </w:p>
+    <w:p>
+      <w:pPr>
+        <w:pStyle w:val="TextBody"/>
+        <w:ind w:hanging="0"/>
+        <w:rPr/>
+      </w:pPr>
+      <w:hyperlink r:id="rId2">
+        <w:r>
+          <w:rPr>
+            <w:rStyle w:val="InternetLink"/>
+            <w:rFonts w:eastAsia="Times New Roman" w:cs="Times New Roman" w:ascii="Calibri" w:hAnsi="Calibri"/>
+            <w:b w:val="false"/>
+            <w:i w:val="false"/>
+            <w:caps w:val="false"/>
+            <w:smallCaps w:val="false"/>
+            <w:color w:val="auto"/>
+            <w:spacing w:val="0"/>
+            <w:kern w:val="0"/>
+            <w:sz w:val="24"/>
+            <w:szCs w:val="24"/>
+            <w:u w:val="none"/>
+            <w:lang w:val="en-US" w:eastAsia="en-US" w:bidi="ar-SA"/>
+          </w:rPr>
+          <w:t>From Concepts to Code: Introduction to Data Science</w:t>
+        </w:r>
+      </w:hyperlink>
+      <w:r>
+        <w:rPr>
+          <w:rFonts w:eastAsia="Times New Roman" w:cs="Times New Roman" w:ascii="Calibri" w:hAnsi="Calibri"/>
+          <w:b w:val="false"/>
+          <w:i w:val="false"/>
+          <w:caps w:val="false"/>
+          <w:smallCaps w:val="false"/>
+          <w:color w:val="auto"/>
+          <w:spacing w:val="0"/>
+          <w:kern w:val="0"/>
+          <w:sz w:val="24"/>
+          <w:szCs w:val="24"/>
+          <w:u w:val="none"/>
+          <w:lang w:val="en-US" w:eastAsia="en-US" w:bidi="ar-SA"/>
+        </w:rPr>
+        <w:t>. Tashman, A.P. Chapman and Hall/CRC.</w:t>
+        <w:br/>
+        <w:t>Provides coverage of the topics that come up in capstone and more generally in the data science field. Optional but recommended.</w:t>
       </w:r>
     </w:p>
     <w:p>
@@ -1481,29 +1556,7 @@
         <w:t xml:space="preserve">Paper   </w:t>
         <w:tab/>
         <w:tab/>
-        <w:t xml:space="preserve">                          </w:t>
-      </w:r>
-      <w:r>
-        <w:rPr>
-          <w:rFonts w:eastAsia="Times New Roman" w:cs="Times New Roman" w:ascii="Calibri" w:hAnsi="Calibri"/>
-          <w:color w:val="auto"/>
-          <w:kern w:val="0"/>
-          <w:sz w:val="24"/>
-          <w:szCs w:val="24"/>
-          <w:lang w:val="en-US" w:eastAsia="en-US" w:bidi="ar-SA"/>
-        </w:rPr>
-        <w:t>2</w:t>
-      </w:r>
-      <w:r>
-        <w:rPr>
-          <w:rFonts w:eastAsia="Times New Roman" w:cs="Times New Roman" w:ascii="Calibri" w:hAnsi="Calibri"/>
-          <w:color w:val="auto"/>
-          <w:kern w:val="0"/>
-          <w:sz w:val="24"/>
-          <w:szCs w:val="24"/>
-          <w:lang w:val="en-US" w:eastAsia="en-US" w:bidi="ar-SA"/>
-        </w:rPr>
-        <w:t>5%</w:t>
+        <w:t xml:space="preserve">                          25%</w:t>
       </w:r>
     </w:p>
     <w:p>
@@ -1613,43 +1666,7 @@
           <w:shd w:fill="auto" w:val="clear"/>
           <w:lang w:val="en-US" w:eastAsia="en-US" w:bidi="ar-SA"/>
         </w:rPr>
-        <w:t xml:space="preserve">Students on same project may receive different grade based on participation </w:t>
-      </w:r>
-      <w:r>
-        <w:rPr>
-          <w:rFonts w:eastAsia="" w:cs="Times New Roman (Headings CS)" w:ascii="Calibri" w:hAnsi="Calibri" w:eastAsiaTheme="majorEastAsia"/>
-          <w:b w:val="false"/>
-          <w:bCs w:val="false"/>
-          <w:i w:val="false"/>
-          <w:caps w:val="false"/>
-          <w:smallCaps w:val="false"/>
-          <w:color w:val="000000" w:themeColor="text1"/>
-          <w:spacing w:val="0"/>
-          <w:kern w:val="0"/>
-          <w:sz w:val="24"/>
-          <w:szCs w:val="32"/>
-          <w:shd w:fill="auto" w:val="clear"/>
-          <w:lang w:val="en-US" w:eastAsia="en-US" w:bidi="ar-SA"/>
-        </w:rPr>
-        <w:t>and</w:t>
-      </w:r>
-      <w:r>
-        <w:rPr>
-          <w:rFonts w:eastAsia="" w:cs="Times New Roman (Headings CS)" w:ascii="Calibri" w:hAnsi="Calibri" w:eastAsiaTheme="majorEastAsia"/>
-          <w:b w:val="false"/>
-          <w:bCs w:val="false"/>
-          <w:i w:val="false"/>
-          <w:caps w:val="false"/>
-          <w:smallCaps w:val="false"/>
-          <w:color w:val="000000" w:themeColor="text1"/>
-          <w:spacing w:val="0"/>
-          <w:kern w:val="0"/>
-          <w:sz w:val="24"/>
-          <w:szCs w:val="32"/>
-          <w:shd w:fill="auto" w:val="clear"/>
-          <w:lang w:val="en-US" w:eastAsia="en-US" w:bidi="ar-SA"/>
-        </w:rPr>
-        <w:t xml:space="preserve"> effort</w:t>
+        <w:t>Students on same project may receive different grade based on participation and effort</w:t>
       </w:r>
     </w:p>
     <w:p>
@@ -1703,14 +1720,8 @@
       </w:pPr>
       <w:r>
         <w:rPr>
-          <w:rFonts w:eastAsia="" w:cs="Times New Roman (Headings CS)" w:eastAsiaTheme="majorEastAsia" w:ascii="Calibri" w:hAnsi="Calibri"/>
-          <w:b/>
-          <w:bCs/>
-          <w:color w:val="000000" w:themeColor="text1"/>
-          <w:kern w:val="0"/>
-          <w:sz w:val="24"/>
-          <w:szCs w:val="32"/>
-          <w:lang w:val="en-US" w:eastAsia="en-US" w:bidi="ar-SA"/>
+          <w:b w:val="false"/>
+          <w:bCs w:val="false"/>
         </w:rPr>
       </w:r>
     </w:p>
@@ -1904,7 +1915,7 @@
         </w:rPr>
         <w:t xml:space="preserve">more information, visit </w:t>
       </w:r>
-      <w:hyperlink r:id="rId2">
+      <w:hyperlink r:id="rId3">
         <w:r>
           <w:rPr>
             <w:rFonts w:eastAsia="Calibri" w:cs="Calibri" w:ascii="Calibri" w:hAnsi="Calibri"/>

</xml_diff>